<commit_message>
Update development plan document
Co-authored-by: Copilot <223556219+Copilot@users.noreply.github.com>
</commit_message>
<xml_diff>
--- a/信息无障碍表格填写助手-开发方案1.0.0.docx
+++ b/信息无障碍表格填写助手-开发方案1.0.0.docx
@@ -4940,17 +4940,42 @@
     </w:p>
     <w:p>
       <w:r>
-        <w:t>13. 新增导入创建工程能力：支持从 HTML、Word、Excel、Jira CSV、Markdown 文件直接导入并创建工程。</w:t>
+        <w:t>13. 新增导入创建工程能力：支持从 HTML、Word、Excel、CSV、Markdown 文件直接导入并创建工程。</w:t>
       </w:r>
     </w:p>
     <w:p>
       <w:r>
-        <w:t>14. 移除 PDF 导出能力，统一保留 HTML、Word、Excel、Jira CSV、Markdown 导出，降低 Windows 环境下原生依赖问题。</w:t>
+        <w:t>14. 移除 PDF 导出能力，统一保留 HTML、Word、Excel、CSV、Markdown 导出，降低 Windows 环境下原生依赖问题。</w:t>
       </w:r>
     </w:p>
     <w:p>
       <w:r>
         <w:t>15. 补充若干稳定性修正：修复右键上下文菜单事件累积绑定、模板缺失保护、导出与导入闭环校验等问题。</w:t>
+      </w:r>
+    </w:p>
+    <w:p>
+      <w:r>
+        <w:t>16. 优化打开流程：新增“打开”子菜单和顶部“打开”按钮菜单，除打开已有工程外，还支持直接打开 HTML、Word、Excel、CSV、Markdown 文件创建工程，且与导出菜单格式保持一致。</w:t>
+      </w:r>
+    </w:p>
+    <w:p>
+      <w:r>
+        <w:t>17. 扩展 GB/T 37668 指标导入能力：从仅 Word 局部支持扩展为 HTML、Word、Excel、CSV、Markdown 全格式导入，并统一转换为检查项。</w:t>
+      </w:r>
+    </w:p>
+    <w:p>
+      <w:r>
+        <w:t>18. 重构导入架构：各格式仅负责抽取文本块和表格，统一交由通用解析器处理；原报告表、GB/T 37668、Jira CSV 均改为表头驱动的结构化 schema，降低格式分支耦合。</w:t>
+      </w:r>
+    </w:p>
+    <w:p>
+      <w:r>
+        <w:t>19. 增强普通文档兼容性：当导入文件不符合专用模板时，自动按段落或表格行兜底生成项目列表，避免创建空工程；覆盖普通 Word、Excel、CSV、HTML、Markdown 文件。</w:t>
+      </w:r>
+    </w:p>
+    <w:p>
+      <w:r>
+        <w:t>20. 同步界面与文档命名：导入入口中的“Jira CSV”统一收敛为“CSV”，与当前菜单结构、README 和导入能力说明保持一致。</w:t>
       </w:r>
     </w:p>
     <w:sectPr>

</xml_diff>